<commit_message>
docs(qa-roles): actualizar QA de roles de seccion
Co-Authored-By: Claude Opus 5 <noreply@anthropic.com>
</commit_message>
<xml_diff>
--- a/docs/qa-roles/QA-Roles-2-Seccion.docx
+++ b/docs/qa-roles/QA-Roles-2-Seccion.docx
@@ -565,12 +565,6 @@
         <w:gridCol w:w="1600"/>
       </w:tblGrid>
       <w:tr>
-        <w:tblPrEx>
-          <w:tblCellMar>
-            <w:top w:w="0" w:type="dxa"/>
-            <w:bottom w:w="0" w:type="dxa"/>
-          </w:tblCellMar>
-        </w:tblPrEx>
         <w:trPr>
           <w:tblHeader/>
         </w:trPr>
@@ -730,12 +724,6 @@
         </w:tc>
       </w:tr>
       <w:tr>
-        <w:tblPrEx>
-          <w:tblCellMar>
-            <w:top w:w="0" w:type="dxa"/>
-            <w:bottom w:w="0" w:type="dxa"/>
-          </w:tblCellMar>
-        </w:tblPrEx>
         <w:tc>
           <w:tcPr>
             <w:tcW w:w="2760" w:type="dxa"/>
@@ -875,12 +863,6 @@
         </w:tc>
       </w:tr>
       <w:tr>
-        <w:tblPrEx>
-          <w:tblCellMar>
-            <w:top w:w="0" w:type="dxa"/>
-            <w:bottom w:w="0" w:type="dxa"/>
-          </w:tblCellMar>
-        </w:tblPrEx>
         <w:tc>
           <w:tcPr>
             <w:tcW w:w="2760" w:type="dxa"/>
@@ -1003,12 +985,6 @@
         </w:tc>
       </w:tr>
       <w:tr>
-        <w:tblPrEx>
-          <w:tblCellMar>
-            <w:top w:w="0" w:type="dxa"/>
-            <w:bottom w:w="0" w:type="dxa"/>
-          </w:tblCellMar>
-        </w:tblPrEx>
         <w:tc>
           <w:tcPr>
             <w:tcW w:w="2760" w:type="dxa"/>
@@ -1058,6 +1034,9 @@
               <w:jc w:val="center"/>
             </w:pPr>
             <w:r>
+              <w:rPr>
+                <w:highlight w:val="yellow"/>
+              </w:rPr>
               <w:t>NO</w:t>
             </w:r>
           </w:p>
@@ -1136,12 +1115,6 @@
         </w:tc>
       </w:tr>
       <w:tr>
-        <w:tblPrEx>
-          <w:tblCellMar>
-            <w:top w:w="0" w:type="dxa"/>
-            <w:bottom w:w="0" w:type="dxa"/>
-          </w:tblCellMar>
-        </w:tblPrEx>
         <w:tc>
           <w:tcPr>
             <w:tcW w:w="2760" w:type="dxa"/>
@@ -1184,6 +1157,7 @@
               <w:rPr>
                 <w:sz w:val="18"/>
                 <w:szCs w:val="18"/>
+                <w:highlight w:val="yellow"/>
               </w:rPr>
               <w:t>SI</w:t>
             </w:r>
@@ -1263,12 +1237,6 @@
         </w:tc>
       </w:tr>
       <w:tr>
-        <w:tblPrEx>
-          <w:tblCellMar>
-            <w:top w:w="0" w:type="dxa"/>
-            <w:bottom w:w="0" w:type="dxa"/>
-          </w:tblCellMar>
-        </w:tblPrEx>
         <w:tc>
           <w:tcPr>
             <w:tcW w:w="2760" w:type="dxa"/>
@@ -1310,8 +1278,32 @@
               <w:rPr>
                 <w:sz w:val="18"/>
                 <w:szCs w:val="18"/>
+                <w:highlight w:val="yellow"/>
               </w:rPr>
               <w:t>SI</w:t>
+            </w:r>
+            <w:r>
+              <w:rPr>
+                <w:sz w:val="18"/>
+                <w:szCs w:val="18"/>
+              </w:rPr>
+              <w:t xml:space="preserve"> (debe enviar solicitud </w:t>
+            </w:r>
+            <w:proofErr w:type="spellStart"/>
+            <w:r>
+              <w:rPr>
+                <w:sz w:val="18"/>
+                <w:szCs w:val="18"/>
+              </w:rPr>
+              <w:t>aprob</w:t>
+            </w:r>
+            <w:proofErr w:type="spellEnd"/>
+            <w:r>
+              <w:rPr>
+                <w:sz w:val="18"/>
+                <w:szCs w:val="18"/>
+              </w:rPr>
+              <w:t>)</w:t>
             </w:r>
           </w:p>
         </w:tc>
@@ -1337,6 +1329,36 @@
               </w:rPr>
               <w:t>SI</w:t>
             </w:r>
+            <w:r>
+              <w:rPr>
+                <w:sz w:val="18"/>
+                <w:szCs w:val="18"/>
+              </w:rPr>
+              <w:t xml:space="preserve"> </w:t>
+            </w:r>
+            <w:r>
+              <w:rPr>
+                <w:sz w:val="18"/>
+                <w:szCs w:val="18"/>
+              </w:rPr>
+              <w:t xml:space="preserve">(debe enviar solicitud </w:t>
+            </w:r>
+            <w:proofErr w:type="spellStart"/>
+            <w:r>
+              <w:rPr>
+                <w:sz w:val="18"/>
+                <w:szCs w:val="18"/>
+              </w:rPr>
+              <w:t>aprob</w:t>
+            </w:r>
+            <w:proofErr w:type="spellEnd"/>
+            <w:r>
+              <w:rPr>
+                <w:sz w:val="18"/>
+                <w:szCs w:val="18"/>
+              </w:rPr>
+              <w:t>)</w:t>
+            </w:r>
           </w:p>
         </w:tc>
         <w:tc>
@@ -1389,12 +1411,6 @@
         </w:tc>
       </w:tr>
       <w:tr>
-        <w:tblPrEx>
-          <w:tblCellMar>
-            <w:top w:w="0" w:type="dxa"/>
-            <w:bottom w:w="0" w:type="dxa"/>
-          </w:tblCellMar>
-        </w:tblPrEx>
         <w:tc>
           <w:tcPr>
             <w:tcW w:w="2760" w:type="dxa"/>
@@ -1516,12 +1532,6 @@
         </w:tc>
       </w:tr>
       <w:tr>
-        <w:tblPrEx>
-          <w:tblCellMar>
-            <w:top w:w="0" w:type="dxa"/>
-            <w:bottom w:w="0" w:type="dxa"/>
-          </w:tblCellMar>
-        </w:tblPrEx>
         <w:tc>
           <w:tcPr>
             <w:tcW w:w="2760" w:type="dxa"/>
@@ -1562,6 +1572,7 @@
               <w:rPr>
                 <w:sz w:val="18"/>
                 <w:szCs w:val="18"/>
+                <w:highlight w:val="red"/>
               </w:rPr>
               <w:t>SI</w:t>
             </w:r>
@@ -1640,12 +1651,6 @@
         </w:tc>
       </w:tr>
       <w:tr>
-        <w:tblPrEx>
-          <w:tblCellMar>
-            <w:top w:w="0" w:type="dxa"/>
-            <w:bottom w:w="0" w:type="dxa"/>
-          </w:tblCellMar>
-        </w:tblPrEx>
         <w:tc>
           <w:tcPr>
             <w:tcW w:w="2760" w:type="dxa"/>
@@ -1683,11 +1688,15 @@
           <w:p>
             <w:pPr>
               <w:jc w:val="center"/>
-            </w:pPr>
-            <w:r>
-              <w:rPr>
-                <w:sz w:val="18"/>
-                <w:szCs w:val="18"/>
+              <w:rPr>
+                <w:highlight w:val="yellow"/>
+              </w:rPr>
+            </w:pPr>
+            <w:r>
+              <w:rPr>
+                <w:sz w:val="18"/>
+                <w:szCs w:val="18"/>
+                <w:highlight w:val="yellow"/>
               </w:rPr>
               <w:t>SI</w:t>
             </w:r>
@@ -1767,12 +1776,6 @@
         </w:tc>
       </w:tr>
       <w:tr>
-        <w:tblPrEx>
-          <w:tblCellMar>
-            <w:top w:w="0" w:type="dxa"/>
-            <w:bottom w:w="0" w:type="dxa"/>
-          </w:tblCellMar>
-        </w:tblPrEx>
         <w:tc>
           <w:tcPr>
             <w:tcW w:w="2760" w:type="dxa"/>
@@ -1808,11 +1811,15 @@
           <w:p>
             <w:pPr>
               <w:jc w:val="center"/>
-            </w:pPr>
-            <w:r>
-              <w:rPr>
-                <w:sz w:val="18"/>
-                <w:szCs w:val="18"/>
+              <w:rPr>
+                <w:highlight w:val="yellow"/>
+              </w:rPr>
+            </w:pPr>
+            <w:r>
+              <w:rPr>
+                <w:sz w:val="18"/>
+                <w:szCs w:val="18"/>
+                <w:highlight w:val="yellow"/>
               </w:rPr>
               <w:t>SI</w:t>
             </w:r>
@@ -1889,12 +1896,6 @@
         </w:tc>
       </w:tr>
       <w:tr>
-        <w:tblPrEx>
-          <w:tblCellMar>
-            <w:top w:w="0" w:type="dxa"/>
-            <w:bottom w:w="0" w:type="dxa"/>
-          </w:tblCellMar>
-        </w:tblPrEx>
         <w:tc>
           <w:tcPr>
             <w:tcW w:w="2760" w:type="dxa"/>
@@ -1932,13 +1933,29 @@
           <w:p>
             <w:pPr>
               <w:jc w:val="center"/>
-            </w:pPr>
-            <w:r>
-              <w:rPr>
-                <w:sz w:val="18"/>
-                <w:szCs w:val="18"/>
-              </w:rPr>
-              <w:t>NO*</w:t>
+              <w:rPr>
+                <w:highlight w:val="yellow"/>
+              </w:rPr>
+            </w:pPr>
+            <w:r>
+              <w:rPr>
+                <w:highlight w:val="yellow"/>
+              </w:rPr>
+              <w:t>SI (</w:t>
+            </w:r>
+            <w:proofErr w:type="spellStart"/>
+            <w:r>
+              <w:rPr>
+                <w:highlight w:val="yellow"/>
+              </w:rPr>
+              <w:t>Info</w:t>
+            </w:r>
+            <w:proofErr w:type="spellEnd"/>
+            <w:r>
+              <w:rPr>
+                <w:highlight w:val="yellow"/>
+              </w:rPr>
+              <w:t xml:space="preserve"> oculta)</w:t>
             </w:r>
           </w:p>
         </w:tc>
@@ -1958,11 +1975,15 @@
               <w:jc w:val="center"/>
             </w:pPr>
             <w:r>
-              <w:rPr>
-                <w:sz w:val="18"/>
-                <w:szCs w:val="18"/>
-              </w:rPr>
-              <w:t>NO*</w:t>
+              <w:t>SI (</w:t>
+            </w:r>
+            <w:proofErr w:type="spellStart"/>
+            <w:r>
+              <w:t>Info</w:t>
+            </w:r>
+            <w:proofErr w:type="spellEnd"/>
+            <w:r>
+              <w:t xml:space="preserve"> oculta)</w:t>
             </w:r>
           </w:p>
         </w:tc>
@@ -1982,11 +2003,15 @@
               <w:jc w:val="center"/>
             </w:pPr>
             <w:r>
-              <w:rPr>
-                <w:sz w:val="18"/>
-                <w:szCs w:val="18"/>
-              </w:rPr>
-              <w:t>NO*</w:t>
+              <w:t>SI (</w:t>
+            </w:r>
+            <w:proofErr w:type="spellStart"/>
+            <w:r>
+              <w:t>Info</w:t>
+            </w:r>
+            <w:proofErr w:type="spellEnd"/>
+            <w:r>
+              <w:t xml:space="preserve"> oculta)</w:t>
             </w:r>
           </w:p>
         </w:tc>
@@ -2006,22 +2031,20 @@
               <w:jc w:val="center"/>
             </w:pPr>
             <w:r>
-              <w:rPr>
-                <w:sz w:val="18"/>
-                <w:szCs w:val="18"/>
-              </w:rPr>
-              <w:t>NO</w:t>
+              <w:t>SI (</w:t>
+            </w:r>
+            <w:proofErr w:type="spellStart"/>
+            <w:r>
+              <w:t>Info</w:t>
+            </w:r>
+            <w:proofErr w:type="spellEnd"/>
+            <w:r>
+              <w:t xml:space="preserve"> oculta)</w:t>
             </w:r>
           </w:p>
         </w:tc>
       </w:tr>
       <w:tr>
-        <w:tblPrEx>
-          <w:tblCellMar>
-            <w:top w:w="0" w:type="dxa"/>
-            <w:bottom w:w="0" w:type="dxa"/>
-          </w:tblCellMar>
-        </w:tblPrEx>
         <w:tc>
           <w:tcPr>
             <w:tcW w:w="2760" w:type="dxa"/>
@@ -2063,6 +2086,7 @@
               <w:rPr>
                 <w:sz w:val="18"/>
                 <w:szCs w:val="18"/>
+                <w:highlight w:val="yellow"/>
               </w:rPr>
               <w:t>NO</w:t>
             </w:r>
@@ -2142,12 +2166,6 @@
         </w:tc>
       </w:tr>
       <w:tr>
-        <w:tblPrEx>
-          <w:tblCellMar>
-            <w:top w:w="0" w:type="dxa"/>
-            <w:bottom w:w="0" w:type="dxa"/>
-          </w:tblCellMar>
-        </w:tblPrEx>
         <w:tc>
           <w:tcPr>
             <w:tcW w:w="2760" w:type="dxa"/>
@@ -2185,11 +2203,15 @@
           <w:p>
             <w:pPr>
               <w:jc w:val="center"/>
-            </w:pPr>
-            <w:r>
-              <w:rPr>
-                <w:sz w:val="18"/>
-                <w:szCs w:val="18"/>
+              <w:rPr>
+                <w:highlight w:val="yellow"/>
+              </w:rPr>
+            </w:pPr>
+            <w:r>
+              <w:rPr>
+                <w:sz w:val="18"/>
+                <w:szCs w:val="18"/>
+                <w:highlight w:val="yellow"/>
               </w:rPr>
               <w:t>ENMASC</w:t>
             </w:r>
@@ -2269,12 +2291,6 @@
         </w:tc>
       </w:tr>
       <w:tr>
-        <w:tblPrEx>
-          <w:tblCellMar>
-            <w:top w:w="0" w:type="dxa"/>
-            <w:bottom w:w="0" w:type="dxa"/>
-          </w:tblCellMar>
-        </w:tblPrEx>
         <w:tc>
           <w:tcPr>
             <w:tcW w:w="2760" w:type="dxa"/>
@@ -2313,10 +2329,9 @@
             </w:pPr>
             <w:r>
               <w:rPr>
-                <w:sz w:val="18"/>
-                <w:szCs w:val="18"/>
-              </w:rPr>
-              <w:t>SI</w:t>
+                <w:highlight w:val="yellow"/>
+              </w:rPr>
+              <w:t>NO</w:t>
             </w:r>
           </w:p>
         </w:tc>
@@ -2335,11 +2350,7 @@
               <w:jc w:val="center"/>
             </w:pPr>
             <w:r>
-              <w:rPr>
-                <w:sz w:val="18"/>
-                <w:szCs w:val="18"/>
-              </w:rPr>
-              <w:t>SI</w:t>
+              <w:t>NO</w:t>
             </w:r>
           </w:p>
         </w:tc>
@@ -2358,11 +2369,7 @@
               <w:jc w:val="center"/>
             </w:pPr>
             <w:r>
-              <w:rPr>
-                <w:sz w:val="18"/>
-                <w:szCs w:val="18"/>
-              </w:rPr>
-              <w:t>SI</w:t>
+              <w:t>NO</w:t>
             </w:r>
           </w:p>
         </w:tc>
@@ -2381,22 +2388,12 @@
               <w:jc w:val="center"/>
             </w:pPr>
             <w:r>
-              <w:rPr>
-                <w:sz w:val="18"/>
-                <w:szCs w:val="18"/>
-              </w:rPr>
-              <w:t>SI</w:t>
+              <w:t>NO</w:t>
             </w:r>
           </w:p>
         </w:tc>
       </w:tr>
       <w:tr>
-        <w:tblPrEx>
-          <w:tblCellMar>
-            <w:top w:w="0" w:type="dxa"/>
-            <w:bottom w:w="0" w:type="dxa"/>
-          </w:tblCellMar>
-        </w:tblPrEx>
         <w:tc>
           <w:tcPr>
             <w:tcW w:w="2760" w:type="dxa"/>
@@ -2439,8 +2436,9 @@
               <w:rPr>
                 <w:sz w:val="18"/>
                 <w:szCs w:val="18"/>
-              </w:rPr>
-              <w:t>R</w:t>
+                <w:highlight w:val="yellow"/>
+              </w:rPr>
+              <w:t>NO</w:t>
             </w:r>
           </w:p>
         </w:tc>
@@ -2464,7 +2462,7 @@
                 <w:sz w:val="18"/>
                 <w:szCs w:val="18"/>
               </w:rPr>
-              <w:t>R</w:t>
+              <w:t>NO</w:t>
             </w:r>
           </w:p>
         </w:tc>
@@ -2518,12 +2516,6 @@
         </w:tc>
       </w:tr>
       <w:tr>
-        <w:tblPrEx>
-          <w:tblCellMar>
-            <w:top w:w="0" w:type="dxa"/>
-            <w:bottom w:w="0" w:type="dxa"/>
-          </w:tblCellMar>
-        </w:tblPrEx>
         <w:tc>
           <w:tcPr>
             <w:tcW w:w="2760" w:type="dxa"/>
@@ -2565,8 +2557,9 @@
               <w:rPr>
                 <w:sz w:val="18"/>
                 <w:szCs w:val="18"/>
-              </w:rPr>
-              <w:t>R</w:t>
+                <w:highlight w:val="yellow"/>
+              </w:rPr>
+              <w:t>NO</w:t>
             </w:r>
           </w:p>
         </w:tc>
@@ -2590,7 +2583,7 @@
                 <w:sz w:val="18"/>
                 <w:szCs w:val="18"/>
               </w:rPr>
-              <w:t>R</w:t>
+              <w:t>NO</w:t>
             </w:r>
           </w:p>
         </w:tc>
@@ -2614,7 +2607,7 @@
                 <w:sz w:val="18"/>
                 <w:szCs w:val="18"/>
               </w:rPr>
-              <w:t>R</w:t>
+              <w:t>NO</w:t>
             </w:r>
           </w:p>
         </w:tc>
@@ -2638,18 +2631,12 @@
                 <w:sz w:val="18"/>
                 <w:szCs w:val="18"/>
               </w:rPr>
-              <w:t>R</w:t>
+              <w:t>NO</w:t>
             </w:r>
           </w:p>
         </w:tc>
       </w:tr>
       <w:tr>
-        <w:tblPrEx>
-          <w:tblCellMar>
-            <w:top w:w="0" w:type="dxa"/>
-            <w:bottom w:w="0" w:type="dxa"/>
-          </w:tblCellMar>
-        </w:tblPrEx>
         <w:tc>
           <w:tcPr>
             <w:tcW w:w="2760" w:type="dxa"/>
@@ -2771,12 +2758,6 @@
         </w:tc>
       </w:tr>
       <w:tr>
-        <w:tblPrEx>
-          <w:tblCellMar>
-            <w:top w:w="0" w:type="dxa"/>
-            <w:bottom w:w="0" w:type="dxa"/>
-          </w:tblCellMar>
-        </w:tblPrEx>
         <w:tc>
           <w:tcPr>
             <w:tcW w:w="2760" w:type="dxa"/>
@@ -2893,12 +2874,6 @@
         </w:tc>
       </w:tr>
       <w:tr>
-        <w:tblPrEx>
-          <w:tblCellMar>
-            <w:top w:w="0" w:type="dxa"/>
-            <w:bottom w:w="0" w:type="dxa"/>
-          </w:tblCellMar>
-        </w:tblPrEx>
         <w:tc>
           <w:tcPr>
             <w:tcW w:w="2760" w:type="dxa"/>
@@ -3020,12 +2995,6 @@
         </w:tc>
       </w:tr>
       <w:tr>
-        <w:tblPrEx>
-          <w:tblCellMar>
-            <w:top w:w="0" w:type="dxa"/>
-            <w:bottom w:w="0" w:type="dxa"/>
-          </w:tblCellMar>
-        </w:tblPrEx>
         <w:tc>
           <w:tcPr>
             <w:tcW w:w="2760" w:type="dxa"/>
@@ -3044,6 +3013,7 @@
                 <w:sz w:val="18"/>
                 <w:szCs w:val="18"/>
               </w:rPr>
+              <w:lastRenderedPageBreak/>
               <w:t>Reportes regionales</w:t>
             </w:r>
           </w:p>
@@ -3144,12 +3114,6 @@
         </w:tc>
       </w:tr>
       <w:tr>
-        <w:tblPrEx>
-          <w:tblCellMar>
-            <w:top w:w="0" w:type="dxa"/>
-            <w:bottom w:w="0" w:type="dxa"/>
-          </w:tblCellMar>
-        </w:tblPrEx>
         <w:tc>
           <w:tcPr>
             <w:tcW w:w="2760" w:type="dxa"/>
@@ -3169,7 +3133,6 @@
                 <w:sz w:val="18"/>
                 <w:szCs w:val="18"/>
               </w:rPr>
-              <w:lastRenderedPageBreak/>
               <w:t>Tienda (ver)</w:t>
             </w:r>
           </w:p>
@@ -3193,6 +3156,7 @@
               <w:rPr>
                 <w:sz w:val="18"/>
                 <w:szCs w:val="18"/>
+                <w:highlight w:val="yellow"/>
               </w:rPr>
               <w:t>SI</w:t>
             </w:r>
@@ -3272,12 +3236,6 @@
         </w:tc>
       </w:tr>
       <w:tr>
-        <w:tblPrEx>
-          <w:tblCellMar>
-            <w:top w:w="0" w:type="dxa"/>
-            <w:bottom w:w="0" w:type="dxa"/>
-          </w:tblCellMar>
-        </w:tblPrEx>
         <w:tc>
           <w:tcPr>
             <w:tcW w:w="2760" w:type="dxa"/>
@@ -4514,12 +4472,6 @@
         <w:gridCol w:w="9360"/>
       </w:tblGrid>
       <w:tr>
-        <w:tblPrEx>
-          <w:tblCellMar>
-            <w:top w:w="0" w:type="dxa"/>
-            <w:bottom w:w="0" w:type="dxa"/>
-          </w:tblCellMar>
-        </w:tblPrEx>
         <w:tc>
           <w:tcPr>
             <w:tcW w:w="9360" w:type="dxa"/>
@@ -4546,12 +4498,6 @@
         </w:tc>
       </w:tr>
       <w:tr>
-        <w:tblPrEx>
-          <w:tblCellMar>
-            <w:top w:w="0" w:type="dxa"/>
-            <w:bottom w:w="0" w:type="dxa"/>
-          </w:tblCellMar>
-        </w:tblPrEx>
         <w:tc>
           <w:tcPr>
             <w:tcW w:w="9360" w:type="dxa"/>
@@ -4682,12 +4628,6 @@
         <w:gridCol w:w="9360"/>
       </w:tblGrid>
       <w:tr>
-        <w:tblPrEx>
-          <w:tblCellMar>
-            <w:top w:w="0" w:type="dxa"/>
-            <w:bottom w:w="0" w:type="dxa"/>
-          </w:tblCellMar>
-        </w:tblPrEx>
         <w:tc>
           <w:tcPr>
             <w:tcW w:w="9360" w:type="dxa"/>
@@ -4726,12 +4666,6 @@
         </w:tc>
       </w:tr>
       <w:tr>
-        <w:tblPrEx>
-          <w:tblCellMar>
-            <w:top w:w="0" w:type="dxa"/>
-            <w:bottom w:w="0" w:type="dxa"/>
-          </w:tblCellMar>
-        </w:tblPrEx>
         <w:tc>
           <w:tcPr>
             <w:tcW w:w="9360" w:type="dxa"/>

</xml_diff>

<commit_message>
docs(qa-roles): actualizar los checklists de Seccion y Region, y anadir las notas de Oficina Nacional
- QA-Roles-2-Seccion y QA-Roles-3-Region: checklists de verificacion por rol,
  con el alcance y las capacidades de cada cargo del desplegable.
- Oficina Nacional: notas de requisito sobre el rol pendiente de crear, su
  circuito de aprobacion de cambios y el acceso a estadisticas.

Co-Authored-By: Claude Opus 5 <noreply@anthropic.com>
</commit_message>
<xml_diff>
--- a/docs/qa-roles/QA-Roles-2-Seccion.docx
+++ b/docs/qa-roles/QA-Roles-2-Seccion.docx
@@ -235,10 +235,7 @@
         <w:t>alcance</w:t>
       </w:r>
       <w:r>
-        <w:t xml:space="preserve"> (que datos ve) y luego</w:t>
-      </w:r>
-      <w:r>
-        <w:t xml:space="preserve"> cada capacidad (que puede hacer).</w:t>
+        <w:t xml:space="preserve"> (que datos ve) y luego cada capacidad (que puede hacer).</w:t>
       </w:r>
     </w:p>
     <w:p>
@@ -363,14 +360,7 @@
           <w:b/>
           <w:bCs/>
         </w:rPr>
-        <w:t>Coordinadores de</w:t>
-      </w:r>
-      <w:r>
-        <w:rPr>
-          <w:b/>
-          <w:bCs/>
-        </w:rPr>
-        <w:t xml:space="preserve"> </w:t>
+        <w:t xml:space="preserve">Coordinadores de </w:t>
       </w:r>
       <w:proofErr w:type="spellStart"/>
       <w:r>
@@ -496,16 +486,7 @@
           <w:sz w:val="18"/>
           <w:szCs w:val="18"/>
         </w:rPr>
-        <w:t>tambie</w:t>
-      </w:r>
-      <w:r>
-        <w:rPr>
-          <w:i/>
-          <w:iCs/>
-          <w:sz w:val="18"/>
-          <w:szCs w:val="18"/>
-        </w:rPr>
-        <w:t>n</w:t>
+        <w:t>tambien</w:t>
       </w:r>
       <w:proofErr w:type="spellEnd"/>
       <w:r>
@@ -855,8 +836,9 @@
               <w:rPr>
                 <w:sz w:val="18"/>
                 <w:szCs w:val="18"/>
-              </w:rPr>
-              <w:t>NO</w:t>
+                <w:highlight w:val="yellow"/>
+              </w:rPr>
+              <w:t>SI</w:t>
             </w:r>
           </w:p>
         </w:tc>
@@ -879,8 +861,9 @@
               <w:rPr>
                 <w:sz w:val="18"/>
                 <w:szCs w:val="18"/>
-              </w:rPr>
-              <w:t>NO</w:t>
+                <w:highlight w:val="yellow"/>
+              </w:rPr>
+              <w:t>SI</w:t>
             </w:r>
           </w:p>
         </w:tc>
@@ -981,6 +964,7 @@
               <w:rPr>
                 <w:sz w:val="18"/>
                 <w:szCs w:val="18"/>
+                <w:highlight w:val="yellow"/>
               </w:rPr>
               <w:t>SI</w:t>
             </w:r>
@@ -1005,6 +989,7 @@
               <w:rPr>
                 <w:sz w:val="18"/>
                 <w:szCs w:val="18"/>
+                <w:highlight w:val="yellow"/>
               </w:rPr>
               <w:t>SI</w:t>
             </w:r>
@@ -1115,6 +1100,7 @@
               <w:rPr>
                 <w:sz w:val="18"/>
                 <w:szCs w:val="18"/>
+                <w:highlight w:val="yellow"/>
               </w:rPr>
               <w:t>NO</w:t>
             </w:r>
@@ -1139,6 +1125,7 @@
               <w:rPr>
                 <w:sz w:val="18"/>
                 <w:szCs w:val="18"/>
+                <w:highlight w:val="yellow"/>
               </w:rPr>
               <w:t>NO</w:t>
             </w:r>
@@ -1241,6 +1228,7 @@
               <w:rPr>
                 <w:sz w:val="18"/>
                 <w:szCs w:val="18"/>
+                <w:highlight w:val="yellow"/>
               </w:rPr>
               <w:t>SI</w:t>
             </w:r>
@@ -1265,6 +1253,7 @@
               <w:rPr>
                 <w:sz w:val="18"/>
                 <w:szCs w:val="18"/>
+                <w:highlight w:val="yellow"/>
               </w:rPr>
               <w:t>SI</w:t>
             </w:r>
@@ -1409,6 +1398,7 @@
               <w:rPr>
                 <w:sz w:val="18"/>
                 <w:szCs w:val="18"/>
+                <w:highlight w:val="yellow"/>
               </w:rPr>
               <w:t>NO</w:t>
             </w:r>
@@ -1433,6 +1423,7 @@
               <w:rPr>
                 <w:sz w:val="18"/>
                 <w:szCs w:val="18"/>
+                <w:highlight w:val="yellow"/>
               </w:rPr>
               <w:t>NO</w:t>
             </w:r>
@@ -1482,8 +1473,9 @@
               <w:rPr>
                 <w:sz w:val="18"/>
                 <w:szCs w:val="18"/>
-              </w:rPr>
-              <w:t>SI</w:t>
+                <w:highlight w:val="yellow"/>
+              </w:rPr>
+              <w:t>NO</w:t>
             </w:r>
           </w:p>
         </w:tc>
@@ -1506,8 +1498,9 @@
               <w:rPr>
                 <w:sz w:val="18"/>
                 <w:szCs w:val="18"/>
-              </w:rPr>
-              <w:t>SI</w:t>
+                <w:highlight w:val="yellow"/>
+              </w:rPr>
+              <w:t>NO</w:t>
             </w:r>
           </w:p>
         </w:tc>
@@ -1530,6 +1523,7 @@
               <w:rPr>
                 <w:sz w:val="18"/>
                 <w:szCs w:val="18"/>
+                <w:highlight w:val="yellow"/>
               </w:rPr>
               <w:t>NO</w:t>
             </w:r>
@@ -1554,6 +1548,7 @@
               <w:rPr>
                 <w:sz w:val="18"/>
                 <w:szCs w:val="18"/>
+                <w:highlight w:val="yellow"/>
               </w:rPr>
               <w:t>NO</w:t>
             </w:r>
@@ -1898,11 +1893,15 @@
           <w:p>
             <w:pPr>
               <w:jc w:val="center"/>
-            </w:pPr>
-            <w:r>
-              <w:rPr>
-                <w:sz w:val="18"/>
-                <w:szCs w:val="18"/>
+              <w:rPr>
+                <w:highlight w:val="yellow"/>
+              </w:rPr>
+            </w:pPr>
+            <w:r>
+              <w:rPr>
+                <w:sz w:val="18"/>
+                <w:szCs w:val="18"/>
+                <w:highlight w:val="yellow"/>
               </w:rPr>
               <w:t>SI</w:t>
             </w:r>
@@ -1921,11 +1920,15 @@
           <w:p>
             <w:pPr>
               <w:jc w:val="center"/>
-            </w:pPr>
-            <w:r>
-              <w:rPr>
-                <w:sz w:val="18"/>
-                <w:szCs w:val="18"/>
+              <w:rPr>
+                <w:highlight w:val="yellow"/>
+              </w:rPr>
+            </w:pPr>
+            <w:r>
+              <w:rPr>
+                <w:sz w:val="18"/>
+                <w:szCs w:val="18"/>
+                <w:highlight w:val="yellow"/>
               </w:rPr>
               <w:t>SI</w:t>
             </w:r>
@@ -2050,16 +2053,28 @@
           <w:p>
             <w:pPr>
               <w:jc w:val="center"/>
-            </w:pPr>
-            <w:r>
+              <w:rPr>
+                <w:highlight w:val="yellow"/>
+              </w:rPr>
+            </w:pPr>
+            <w:r>
+              <w:rPr>
+                <w:highlight w:val="yellow"/>
+              </w:rPr>
               <w:t>SI (</w:t>
             </w:r>
             <w:proofErr w:type="spellStart"/>
             <w:r>
+              <w:rPr>
+                <w:highlight w:val="yellow"/>
+              </w:rPr>
               <w:t>Info</w:t>
             </w:r>
             <w:proofErr w:type="spellEnd"/>
             <w:r>
+              <w:rPr>
+                <w:highlight w:val="yellow"/>
+              </w:rPr>
               <w:t xml:space="preserve"> oculta)</w:t>
             </w:r>
           </w:p>
@@ -2078,16 +2093,28 @@
           <w:p>
             <w:pPr>
               <w:jc w:val="center"/>
-            </w:pPr>
-            <w:r>
+              <w:rPr>
+                <w:highlight w:val="yellow"/>
+              </w:rPr>
+            </w:pPr>
+            <w:r>
+              <w:rPr>
+                <w:highlight w:val="yellow"/>
+              </w:rPr>
               <w:t>SI (</w:t>
             </w:r>
             <w:proofErr w:type="spellStart"/>
             <w:r>
+              <w:rPr>
+                <w:highlight w:val="yellow"/>
+              </w:rPr>
               <w:t>Info</w:t>
             </w:r>
             <w:proofErr w:type="spellEnd"/>
             <w:r>
+              <w:rPr>
+                <w:highlight w:val="yellow"/>
+              </w:rPr>
               <w:t xml:space="preserve"> oculta)</w:t>
             </w:r>
           </w:p>
@@ -2188,6 +2215,7 @@
               <w:rPr>
                 <w:sz w:val="18"/>
                 <w:szCs w:val="18"/>
+                <w:highlight w:val="yellow"/>
               </w:rPr>
               <w:t>NO</w:t>
             </w:r>
@@ -2212,6 +2240,7 @@
               <w:rPr>
                 <w:sz w:val="18"/>
                 <w:szCs w:val="18"/>
+                <w:highlight w:val="yellow"/>
               </w:rPr>
               <w:t>NO</w:t>
             </w:r>
@@ -2317,6 +2346,7 @@
               <w:rPr>
                 <w:sz w:val="18"/>
                 <w:szCs w:val="18"/>
+                <w:highlight w:val="yellow"/>
               </w:rPr>
               <w:t>ENMASC</w:t>
             </w:r>
@@ -2341,6 +2371,7 @@
               <w:rPr>
                 <w:sz w:val="18"/>
                 <w:szCs w:val="18"/>
+                <w:highlight w:val="yellow"/>
               </w:rPr>
               <w:t>ENMASC</w:t>
             </w:r>
@@ -2432,6 +2463,9 @@
               <w:jc w:val="center"/>
             </w:pPr>
             <w:r>
+              <w:rPr>
+                <w:highlight w:val="yellow"/>
+              </w:rPr>
               <w:t>NO</w:t>
             </w:r>
           </w:p>
@@ -2451,6 +2485,9 @@
               <w:jc w:val="center"/>
             </w:pPr>
             <w:r>
+              <w:rPr>
+                <w:highlight w:val="yellow"/>
+              </w:rPr>
               <w:t>NO</w:t>
             </w:r>
           </w:p>
@@ -2550,8 +2587,7 @@
             </w:pPr>
             <w:r>
               <w:rPr>
-                <w:sz w:val="18"/>
-                <w:szCs w:val="18"/>
+                <w:highlight w:val="yellow"/>
               </w:rPr>
               <w:t>NO</w:t>
             </w:r>
@@ -2574,8 +2610,7 @@
             </w:pPr>
             <w:r>
               <w:rPr>
-                <w:sz w:val="18"/>
-                <w:szCs w:val="18"/>
+                <w:highlight w:val="yellow"/>
               </w:rPr>
               <w:t>NO</w:t>
             </w:r>
@@ -2672,11 +2707,15 @@
           <w:p>
             <w:pPr>
               <w:jc w:val="center"/>
-            </w:pPr>
-            <w:r>
-              <w:rPr>
-                <w:sz w:val="18"/>
-                <w:szCs w:val="18"/>
+              <w:rPr>
+                <w:highlight w:val="yellow"/>
+              </w:rPr>
+            </w:pPr>
+            <w:r>
+              <w:rPr>
+                <w:sz w:val="18"/>
+                <w:szCs w:val="18"/>
+                <w:highlight w:val="yellow"/>
               </w:rPr>
               <w:t>NO</w:t>
             </w:r>
@@ -2696,11 +2735,15 @@
           <w:p>
             <w:pPr>
               <w:jc w:val="center"/>
-            </w:pPr>
-            <w:r>
-              <w:rPr>
-                <w:sz w:val="18"/>
-                <w:szCs w:val="18"/>
+              <w:rPr>
+                <w:highlight w:val="yellow"/>
+              </w:rPr>
+            </w:pPr>
+            <w:r>
+              <w:rPr>
+                <w:sz w:val="18"/>
+                <w:szCs w:val="18"/>
+                <w:highlight w:val="yellow"/>
               </w:rPr>
               <w:t>NO</w:t>
             </w:r>
@@ -3247,11 +3290,15 @@
           <w:p>
             <w:pPr>
               <w:jc w:val="center"/>
-            </w:pPr>
-            <w:r>
-              <w:rPr>
-                <w:sz w:val="18"/>
-                <w:szCs w:val="18"/>
+              <w:rPr>
+                <w:highlight w:val="yellow"/>
+              </w:rPr>
+            </w:pPr>
+            <w:r>
+              <w:rPr>
+                <w:sz w:val="18"/>
+                <w:szCs w:val="18"/>
+                <w:highlight w:val="yellow"/>
               </w:rPr>
               <w:t>SI</w:t>
             </w:r>
@@ -3271,11 +3318,15 @@
           <w:p>
             <w:pPr>
               <w:jc w:val="center"/>
-            </w:pPr>
-            <w:r>
-              <w:rPr>
-                <w:sz w:val="18"/>
-                <w:szCs w:val="18"/>
+              <w:rPr>
+                <w:highlight w:val="yellow"/>
+              </w:rPr>
+            </w:pPr>
+            <w:r>
+              <w:rPr>
+                <w:sz w:val="18"/>
+                <w:szCs w:val="18"/>
+                <w:highlight w:val="yellow"/>
               </w:rPr>
               <w:t>SI</w:t>
             </w:r>
@@ -3295,11 +3346,15 @@
           <w:p>
             <w:pPr>
               <w:jc w:val="center"/>
-            </w:pPr>
-            <w:r>
-              <w:rPr>
-                <w:sz w:val="18"/>
-                <w:szCs w:val="18"/>
+              <w:rPr>
+                <w:highlight w:val="yellow"/>
+              </w:rPr>
+            </w:pPr>
+            <w:r>
+              <w:rPr>
+                <w:sz w:val="18"/>
+                <w:szCs w:val="18"/>
+                <w:highlight w:val="yellow"/>
               </w:rPr>
               <w:t>SI</w:t>
             </w:r>
@@ -3555,16 +3610,7 @@
           <w:sz w:val="18"/>
           <w:szCs w:val="18"/>
         </w:rPr>
-        <w:t xml:space="preserve"> per</w:t>
-      </w:r>
-      <w:r>
-        <w:rPr>
-          <w:i/>
-          <w:iCs/>
-          <w:sz w:val="18"/>
-          <w:szCs w:val="18"/>
-        </w:rPr>
-        <w:t>o DESHABILITADOS (no abren la ficha). Los cargos de consulta no tienen permiso de menores.</w:t>
+        <w:t xml:space="preserve"> pero DESHABILITADOS (no abren la ficha). Los cargos de consulta no tienen permiso de menores.</w:t>
       </w:r>
     </w:p>
     <w:p>
@@ -3616,10 +3662,7 @@
       </w:r>
       <w:proofErr w:type="spellEnd"/>
       <w:r>
-        <w:t xml:space="preserve"> directa del miembro o por su destacame</w:t>
-      </w:r>
-      <w:r>
-        <w:t xml:space="preserve">nto dentro de la </w:t>
+        <w:t xml:space="preserve"> directa del miembro o por su destacamento dentro de la </w:t>
       </w:r>
       <w:proofErr w:type="spellStart"/>
       <w:r>
@@ -3684,10 +3727,7 @@
       </w:r>
       <w:proofErr w:type="gramStart"/>
       <w:r>
-        <w:t>destacamen</w:t>
-      </w:r>
-      <w:r>
-        <w:t>tos</w:t>
+        <w:t>destacamentos</w:t>
       </w:r>
       <w:proofErr w:type="gramEnd"/>
       <w:r>
@@ -3779,10 +3819,7 @@
         <w:t xml:space="preserve">Solicitar acceso: </w:t>
       </w:r>
       <w:r>
-        <w:t>al ver datos personales o Dispensa Medica enmascarados, pueden solicitar acceso</w:t>
-      </w:r>
-      <w:r>
-        <w:t xml:space="preserve"> al Coordinador de Destacamento del miembro (</w:t>
+        <w:t>al ver datos personales o Dispensa Medica enmascarados, pueden solicitar acceso al Coordinador de Destacamento del miembro (</w:t>
       </w:r>
       <w:proofErr w:type="spellStart"/>
       <w:r>
@@ -3891,17 +3928,7 @@
           <w:sz w:val="30"/>
           <w:szCs w:val="30"/>
         </w:rPr>
-        <w:t xml:space="preserve"> por </w:t>
-      </w:r>
-      <w:r>
-        <w:rPr>
-          <w:b/>
-          <w:bCs/>
-          <w:color w:val="1F4E79"/>
-          <w:sz w:val="30"/>
-          <w:szCs w:val="30"/>
-        </w:rPr>
-        <w:t>rol</w:t>
+        <w:t xml:space="preserve"> por rol</w:t>
       </w:r>
     </w:p>
     <w:p>
@@ -3929,14 +3956,7 @@
           <w:sz w:val="24"/>
           <w:szCs w:val="24"/>
         </w:rPr>
-        <w:t>☐</w:t>
-      </w:r>
-      <w:r>
-        <w:rPr>
-          <w:sz w:val="24"/>
-          <w:szCs w:val="24"/>
-        </w:rPr>
-        <w:t xml:space="preserve">  </w:t>
+        <w:t xml:space="preserve">☐  </w:t>
       </w:r>
       <w:r>
         <w:t>Ve</w:t>
@@ -3964,14 +3984,7 @@
           <w:sz w:val="24"/>
           <w:szCs w:val="24"/>
         </w:rPr>
-        <w:t>☐</w:t>
-      </w:r>
-      <w:r>
-        <w:rPr>
-          <w:sz w:val="24"/>
-          <w:szCs w:val="24"/>
-        </w:rPr>
-        <w:t xml:space="preserve">  </w:t>
+        <w:t xml:space="preserve">☐  </w:t>
       </w:r>
       <w:r>
         <w:t>Edita</w:t>
@@ -4007,14 +4020,7 @@
           <w:sz w:val="24"/>
           <w:szCs w:val="24"/>
         </w:rPr>
-        <w:t>☐</w:t>
-      </w:r>
-      <w:r>
-        <w:rPr>
-          <w:sz w:val="24"/>
-          <w:szCs w:val="24"/>
-        </w:rPr>
-        <w:t xml:space="preserve">  </w:t>
+        <w:t xml:space="preserve">☐  </w:t>
       </w:r>
       <w:r>
         <w:t>NO</w:t>
@@ -4034,14 +4040,7 @@
           <w:sz w:val="24"/>
           <w:szCs w:val="24"/>
         </w:rPr>
-        <w:t>☐</w:t>
-      </w:r>
-      <w:r>
-        <w:rPr>
-          <w:sz w:val="24"/>
-          <w:szCs w:val="24"/>
-        </w:rPr>
-        <w:t xml:space="preserve">  </w:t>
+        <w:t xml:space="preserve">☐  </w:t>
       </w:r>
       <w:r>
         <w:t>Ve</w:t>
@@ -4061,14 +4060,7 @@
           <w:sz w:val="24"/>
           <w:szCs w:val="24"/>
         </w:rPr>
-        <w:t>☐</w:t>
-      </w:r>
-      <w:r>
-        <w:rPr>
-          <w:sz w:val="24"/>
-          <w:szCs w:val="24"/>
-        </w:rPr>
-        <w:t xml:space="preserve">  </w:t>
+        <w:t xml:space="preserve">☐  </w:t>
       </w:r>
       <w:r>
         <w:t>Datos</w:t>
@@ -4088,14 +4080,7 @@
           <w:sz w:val="24"/>
           <w:szCs w:val="24"/>
         </w:rPr>
-        <w:t>☐</w:t>
-      </w:r>
-      <w:r>
-        <w:rPr>
-          <w:sz w:val="24"/>
-          <w:szCs w:val="24"/>
-        </w:rPr>
-        <w:t xml:space="preserve">  </w:t>
+        <w:t xml:space="preserve">☐  </w:t>
       </w:r>
       <w:r>
         <w:t>Dispensa</w:t>
@@ -4115,14 +4100,7 @@
           <w:sz w:val="24"/>
           <w:szCs w:val="24"/>
         </w:rPr>
-        <w:t>☐</w:t>
-      </w:r>
-      <w:r>
-        <w:rPr>
-          <w:sz w:val="24"/>
-          <w:szCs w:val="24"/>
-        </w:rPr>
-        <w:t xml:space="preserve">  </w:t>
+        <w:t xml:space="preserve">☐  </w:t>
       </w:r>
       <w:r>
         <w:t>Reportes</w:t>
@@ -4144,16 +4122,7 @@
           <w:sz w:val="23"/>
           <w:szCs w:val="23"/>
         </w:rPr>
-        <w:t>2) Sub-C</w:t>
-      </w:r>
-      <w:r>
-        <w:rPr>
-          <w:b/>
-          <w:bCs/>
-          <w:sz w:val="23"/>
-          <w:szCs w:val="23"/>
-        </w:rPr>
-        <w:t>oordinador Seccional</w:t>
+        <w:t>2) Sub-Coordinador Seccional</w:t>
       </w:r>
     </w:p>
     <w:p>
@@ -4166,14 +4135,7 @@
           <w:sz w:val="24"/>
           <w:szCs w:val="24"/>
         </w:rPr>
-        <w:t>☐</w:t>
-      </w:r>
-      <w:r>
-        <w:rPr>
-          <w:sz w:val="24"/>
-          <w:szCs w:val="24"/>
-        </w:rPr>
-        <w:t xml:space="preserve">  </w:t>
+        <w:t xml:space="preserve">☐  </w:t>
       </w:r>
       <w:r>
         <w:t>Igual</w:t>
@@ -4201,14 +4163,7 @@
           <w:sz w:val="24"/>
           <w:szCs w:val="24"/>
         </w:rPr>
-        <w:t>☐</w:t>
-      </w:r>
-      <w:r>
-        <w:rPr>
-          <w:sz w:val="24"/>
-          <w:szCs w:val="24"/>
-        </w:rPr>
-        <w:t xml:space="preserve">  </w:t>
+        <w:t xml:space="preserve">☐  </w:t>
       </w:r>
       <w:r>
         <w:t>Crea</w:t>
@@ -4236,14 +4191,7 @@
           <w:sz w:val="24"/>
           <w:szCs w:val="24"/>
         </w:rPr>
-        <w:t>☐</w:t>
-      </w:r>
-      <w:r>
-        <w:rPr>
-          <w:sz w:val="24"/>
-          <w:szCs w:val="24"/>
-        </w:rPr>
-        <w:t xml:space="preserve">  </w:t>
+        <w:t xml:space="preserve">☐  </w:t>
       </w:r>
       <w:r>
         <w:t>Ve</w:t>
@@ -4325,16 +4273,7 @@
           <w:sz w:val="23"/>
           <w:szCs w:val="23"/>
         </w:rPr>
-        <w:t xml:space="preserve"> / Pr</w:t>
-      </w:r>
-      <w:r>
-        <w:rPr>
-          <w:b/>
-          <w:bCs/>
-          <w:sz w:val="23"/>
-          <w:szCs w:val="23"/>
-        </w:rPr>
-        <w:t>ograma)</w:t>
+        <w:t xml:space="preserve"> / Programa)</w:t>
       </w:r>
     </w:p>
     <w:p>
@@ -4347,14 +4286,7 @@
           <w:sz w:val="24"/>
           <w:szCs w:val="24"/>
         </w:rPr>
-        <w:t>☐</w:t>
-      </w:r>
-      <w:r>
-        <w:rPr>
-          <w:sz w:val="24"/>
-          <w:szCs w:val="24"/>
-        </w:rPr>
-        <w:t xml:space="preserve">  </w:t>
+        <w:t xml:space="preserve">☐  </w:t>
       </w:r>
       <w:r>
         <w:t>Solo</w:t>
@@ -4382,14 +4314,7 @@
           <w:sz w:val="24"/>
           <w:szCs w:val="24"/>
         </w:rPr>
-        <w:t>☐</w:t>
-      </w:r>
-      <w:r>
-        <w:rPr>
-          <w:sz w:val="24"/>
-          <w:szCs w:val="24"/>
-        </w:rPr>
-        <w:t xml:space="preserve">  </w:t>
+        <w:t xml:space="preserve">☐  </w:t>
       </w:r>
       <w:r>
         <w:t>NO</w:t>
@@ -4409,14 +4334,7 @@
           <w:sz w:val="24"/>
           <w:szCs w:val="24"/>
         </w:rPr>
-        <w:t>☐</w:t>
-      </w:r>
-      <w:r>
-        <w:rPr>
-          <w:sz w:val="24"/>
-          <w:szCs w:val="24"/>
-        </w:rPr>
-        <w:t xml:space="preserve">  </w:t>
+        <w:t xml:space="preserve">☐  </w:t>
       </w:r>
       <w:r>
         <w:t>Ven</w:t>
@@ -4436,14 +4354,7 @@
           <w:sz w:val="24"/>
           <w:szCs w:val="24"/>
         </w:rPr>
-        <w:t>☐</w:t>
-      </w:r>
-      <w:r>
-        <w:rPr>
-          <w:sz w:val="24"/>
-          <w:szCs w:val="24"/>
-        </w:rPr>
-        <w:t xml:space="preserve">  </w:t>
+        <w:t xml:space="preserve">☐  </w:t>
       </w:r>
       <w:r>
         <w:t>Ven</w:t>
@@ -4463,14 +4374,7 @@
           <w:sz w:val="24"/>
           <w:szCs w:val="24"/>
         </w:rPr>
-        <w:t>☐</w:t>
-      </w:r>
-      <w:r>
-        <w:rPr>
-          <w:sz w:val="24"/>
-          <w:szCs w:val="24"/>
-        </w:rPr>
-        <w:t xml:space="preserve">  </w:t>
+        <w:t xml:space="preserve">☐  </w:t>
       </w:r>
       <w:r>
         <w:t>Reportes</w:t>
@@ -4545,14 +4449,7 @@
           <w:sz w:val="24"/>
           <w:szCs w:val="24"/>
         </w:rPr>
-        <w:t>☐</w:t>
-      </w:r>
-      <w:r>
-        <w:rPr>
-          <w:sz w:val="24"/>
-          <w:szCs w:val="24"/>
-        </w:rPr>
-        <w:t xml:space="preserve">  </w:t>
+        <w:t xml:space="preserve">☐  </w:t>
       </w:r>
       <w:r>
         <w:t>Mismo</w:t>
@@ -4567,10 +4464,7 @@
       </w:r>
       <w:proofErr w:type="spellEnd"/>
       <w:r>
-        <w:t xml:space="preserve"> PE</w:t>
-      </w:r>
-      <w:r>
-        <w:t xml:space="preserve">RO </w:t>
+        <w:t xml:space="preserve"> PERO </w:t>
       </w:r>
       <w:proofErr w:type="spellStart"/>
       <w:r>
@@ -4623,14 +4517,7 @@
           <w:sz w:val="24"/>
           <w:szCs w:val="24"/>
         </w:rPr>
-        <w:t>☐</w:t>
-      </w:r>
-      <w:r>
-        <w:rPr>
-          <w:sz w:val="24"/>
-          <w:szCs w:val="24"/>
-        </w:rPr>
-        <w:t xml:space="preserve">  </w:t>
+        <w:t xml:space="preserve">☐  </w:t>
       </w:r>
       <w:r>
         <w:t>Consulta</w:t>
@@ -4658,14 +4545,7 @@
           <w:sz w:val="24"/>
           <w:szCs w:val="24"/>
         </w:rPr>
-        <w:t>☐</w:t>
-      </w:r>
-      <w:r>
-        <w:rPr>
-          <w:sz w:val="24"/>
-          <w:szCs w:val="24"/>
-        </w:rPr>
-        <w:t xml:space="preserve">  </w:t>
+        <w:t xml:space="preserve">☐  </w:t>
       </w:r>
       <w:r>
         <w:t>Datos</w:t>
@@ -4765,14 +4645,7 @@
                 <w:sz w:val="18"/>
                 <w:szCs w:val="18"/>
               </w:rPr>
-              <w:t>⚠</w:t>
-            </w:r>
-            <w:r>
-              <w:rPr>
-                <w:sz w:val="18"/>
-                <w:szCs w:val="18"/>
-              </w:rPr>
-              <w:t xml:space="preserve">  Los</w:t>
+              <w:t>⚠  Los</w:t>
             </w:r>
             <w:proofErr w:type="gramEnd"/>
             <w:r>
@@ -4825,14 +4698,7 @@
                 <w:sz w:val="18"/>
                 <w:szCs w:val="18"/>
               </w:rPr>
-              <w:t>⚠</w:t>
-            </w:r>
-            <w:r>
-              <w:rPr>
-                <w:sz w:val="18"/>
-                <w:szCs w:val="18"/>
-              </w:rPr>
-              <w:t xml:space="preserve">  Verificar</w:t>
+              <w:t>⚠  Verificar</w:t>
             </w:r>
             <w:proofErr w:type="gramEnd"/>
             <w:r>
@@ -4856,14 +4722,7 @@
                 <w:sz w:val="18"/>
                 <w:szCs w:val="18"/>
               </w:rPr>
-              <w:t xml:space="preserve"> se comportan los menores en su lista (apa</w:t>
-            </w:r>
-            <w:r>
-              <w:rPr>
-                <w:sz w:val="18"/>
-                <w:szCs w:val="18"/>
-              </w:rPr>
-              <w:t>recen? se pueden abrir?).</w:t>
+              <w:t xml:space="preserve"> se comportan los menores en su lista (aparecen? se pueden abrir?).</w:t>
             </w:r>
           </w:p>
         </w:tc>
@@ -4954,14 +4813,7 @@
                 <w:sz w:val="18"/>
                 <w:szCs w:val="18"/>
               </w:rPr>
-              <w:t>⚠</w:t>
-            </w:r>
-            <w:r>
-              <w:rPr>
-                <w:sz w:val="18"/>
-                <w:szCs w:val="18"/>
-              </w:rPr>
-              <w:t xml:space="preserve">  Los</w:t>
+              <w:t>⚠  Los</w:t>
             </w:r>
             <w:proofErr w:type="gramEnd"/>
             <w:r>
@@ -5033,14 +4885,7 @@
                 <w:sz w:val="18"/>
                 <w:szCs w:val="18"/>
               </w:rPr>
-              <w:t>), aunque su lista de permisos no incluye ninguna escritura. Los 4 cargos de consulta SI tienen</w:t>
-            </w:r>
-            <w:r>
-              <w:rPr>
-                <w:sz w:val="18"/>
-                <w:szCs w:val="18"/>
-              </w:rPr>
-              <w:t xml:space="preserve"> </w:t>
+              <w:t xml:space="preserve">), aunque su lista de permisos no incluye ninguna escritura. Los 4 cargos de consulta SI tienen </w:t>
             </w:r>
             <w:proofErr w:type="spellStart"/>
             <w:r>
@@ -5069,14 +4914,7 @@
                 <w:sz w:val="18"/>
                 <w:szCs w:val="18"/>
               </w:rPr>
-              <w:t>⚠</w:t>
-            </w:r>
-            <w:r>
-              <w:rPr>
-                <w:sz w:val="18"/>
-                <w:szCs w:val="18"/>
-              </w:rPr>
-              <w:t xml:space="preserve">  Confirmar</w:t>
+              <w:t>⚠  Confirmar</w:t>
             </w:r>
             <w:proofErr w:type="gramEnd"/>
             <w:r>

</xml_diff>